<commit_message>
Part B: add punctuation clues; replace demos with 2 made-up purpose questions (not exam questions)
</commit_message>
<xml_diff>
--- a/F6_SP_Lesson_4_2013_Part_A_Open-Ended_Teacher_Version.docx
+++ b/F6_SP_Lesson_4_2013_Part_A_Open-Ended_Teacher_Version.docx
@@ -1164,7 +1164,175 @@
           <w:b/>
           <w:sz w:val="22"/>
         </w:rPr>
-        <w:t>3. Three-step attack</w:t>
+        <w:t>3. Punctuation clues — read to the RIGHT of the mark</w:t>
+      </w:r>
+    </w:p>
+    <w:p>
+      <w:pPr>
+        <w:spacing w:after="0"/>
+      </w:pPr>
+      <w:r>
+        <w:rPr>
+          <w:b w:val="0"/>
+          <w:sz w:val="22"/>
+        </w:rPr>
+        <w:t xml:space="preserve">•  </w:t>
+      </w:r>
+      <w:r>
+        <w:rPr>
+          <w:b/>
+          <w:sz w:val="22"/>
+        </w:rPr>
+        <w:t>Dash (—):</w:t>
+      </w:r>
+      <w:r>
+        <w:rPr>
+          <w:b w:val="0"/>
+          <w:sz w:val="22"/>
+        </w:rPr>
+        <w:t xml:space="preserve">  what follows often explains or gives the reason for what came before</w:t>
+      </w:r>
+    </w:p>
+    <w:p>
+      <w:pPr>
+        <w:spacing w:after="0"/>
+      </w:pPr>
+      <w:r>
+        <w:rPr>
+          <w:b w:val="0"/>
+          <w:sz w:val="22"/>
+        </w:rPr>
+        <w:t xml:space="preserve">•  </w:t>
+      </w:r>
+      <w:r>
+        <w:rPr>
+          <w:b/>
+          <w:sz w:val="22"/>
+        </w:rPr>
+        <w:t>Colon (:):</w:t>
+      </w:r>
+      <w:r>
+        <w:rPr>
+          <w:b w:val="0"/>
+          <w:sz w:val="22"/>
+        </w:rPr>
+        <w:t xml:space="preserve">  announces an explanation or the answer itself</w:t>
+      </w:r>
+    </w:p>
+    <w:p>
+      <w:pPr>
+        <w:spacing w:after="0"/>
+      </w:pPr>
+      <w:r>
+        <w:rPr>
+          <w:b w:val="0"/>
+          <w:sz w:val="22"/>
+        </w:rPr>
+        <w:t xml:space="preserve">•  </w:t>
+      </w:r>
+      <w:r>
+        <w:rPr>
+          <w:b/>
+          <w:sz w:val="22"/>
+        </w:rPr>
+        <w:t>Quotation marks (“ ”):</w:t>
+      </w:r>
+      <w:r>
+        <w:rPr>
+          <w:b w:val="0"/>
+          <w:sz w:val="22"/>
+        </w:rPr>
+        <w:t xml:space="preserve">  for “According to X” questions, the reason is usually inside the quoted speech</w:t>
+      </w:r>
+    </w:p>
+    <w:p>
+      <w:pPr>
+        <w:spacing w:after="0"/>
+      </w:pPr>
+      <w:r>
+        <w:rPr>
+          <w:b w:val="0"/>
+          <w:sz w:val="22"/>
+        </w:rPr>
+        <w:t xml:space="preserve">•  </w:t>
+      </w:r>
+      <w:r>
+        <w:rPr>
+          <w:b/>
+          <w:sz w:val="22"/>
+        </w:rPr>
+        <w:t>Brackets ( ):</w:t>
+      </w:r>
+      <w:r>
+        <w:rPr>
+          <w:b w:val="0"/>
+          <w:sz w:val="22"/>
+        </w:rPr>
+        <w:t xml:space="preserve">  add a definition or extra information — useful for definition questions</w:t>
+      </w:r>
+    </w:p>
+    <w:p>
+      <w:pPr>
+        <w:spacing w:after="0"/>
+      </w:pPr>
+      <w:r>
+        <w:rPr>
+          <w:b w:val="0"/>
+          <w:sz w:val="22"/>
+        </w:rPr>
+        <w:t xml:space="preserve">•  </w:t>
+      </w:r>
+      <w:r>
+        <w:rPr>
+          <w:b/>
+          <w:sz w:val="22"/>
+        </w:rPr>
+        <w:t>Semicolon (;):</w:t>
+      </w:r>
+      <w:r>
+        <w:rPr>
+          <w:b w:val="0"/>
+          <w:sz w:val="22"/>
+        </w:rPr>
+        <w:t xml:space="preserve">  links two closely related ideas — the reason can sit on either side</w:t>
+      </w:r>
+    </w:p>
+    <w:p>
+      <w:pPr>
+        <w:spacing w:after="0"/>
+      </w:pPr>
+      <w:r>
+        <w:rPr>
+          <w:b w:val="0"/>
+          <w:sz w:val="22"/>
+        </w:rPr>
+        <w:t xml:space="preserve">•  </w:t>
+      </w:r>
+      <w:r>
+        <w:rPr>
+          <w:b/>
+          <w:sz w:val="22"/>
+        </w:rPr>
+        <w:t>Rhetorical question (?):</w:t>
+      </w:r>
+      <w:r>
+        <w:rPr>
+          <w:b w:val="0"/>
+          <w:sz w:val="22"/>
+        </w:rPr>
+        <w:t xml:space="preserve">  the writer may ask a question and then answer it himself — the answer is the reason</w:t>
+      </w:r>
+    </w:p>
+    <w:p>
+      <w:pPr>
+        <w:spacing w:before="80" w:after="80"/>
+      </w:pPr>
+      <w:r>
+        <w:rPr>
+          <w:b/>
+          <w:sz w:val="22"/>
+        </w:rPr>
+        <w:t>4. Three-step attack</w:t>
       </w:r>
     </w:p>
     <w:p>
@@ -1188,7 +1356,7 @@
           <w:b w:val="0"/>
           <w:sz w:val="22"/>
         </w:rPr>
-        <w:t>Step 2 — Find the signal word in the paragraph: because / to / so that.</w:t>
+        <w:t>Step 2 — Find the signal word (because / to / so that) or the punctuation clue (— : ; “ ”) in the paragraph.</w:t>
       </w:r>
     </w:p>
     <w:p>
@@ -1212,7 +1380,7 @@
           <w:b/>
           <w:sz w:val="22"/>
         </w:rPr>
-        <w:t>4. Demo Question 1 — Reason (“Why …?”)</w:t>
+        <w:t>5. Demo Question 1 — Purpose (“What is the purpose of …?”)</w:t>
       </w:r>
     </w:p>
     <w:p>
@@ -1224,7 +1392,7 @@
           <w:b/>
           <w:sz w:val="22"/>
         </w:rPr>
-        <w:t>Paragraph 5 (lines 51–56):</w:t>
+        <w:t>Read this paragraph (demo — not from the examination paper):</w:t>
       </w:r>
     </w:p>
     <w:p>
@@ -1236,7 +1404,7 @@
           <w:b w:val="0"/>
           <w:sz w:val="22"/>
         </w:rPr>
-        <w:t>“Qin’s army of clay soldiers and horses was not a somber procession but a supernatural display of bold colors: red and green, purple and yellow. Sadly, most of the colors did not survive the crucible of time — or the exposure to air that comes with discovery and excavation. In earlier digs, archaeologists often watched helplessly as the warriors’ colors disintegrated in the dry Xian air.”</w:t>
+        <w:t>“Every summer, the city’s Maritime Museum hosts a model-ship race for children. Families crowd the harbour wall to watch, but the race itself lasts only ten minutes: the real goal is to draw young visitors into the exhibition halls, where full-size replicas of ancient junks hang from the ceiling. Curator Mei Ling knows that few parents will bring their children through the door for ‘a few old boats’, yet a race day never fails to fill the galleries.”</w:t>
       </w:r>
     </w:p>
     <w:p>
@@ -1255,7 +1423,7 @@
           <w:b w:val="0"/>
           <w:sz w:val="22"/>
         </w:rPr>
-        <w:t>According to paragraph 5, why did the colours of the warriors not survive?</w:t>
+        <w:t>What is the purpose of the model-ship race?</w:t>
       </w:r>
     </w:p>
     <w:p>
@@ -1279,7 +1447,7 @@
           <w:b w:val="0"/>
           <w:sz w:val="22"/>
         </w:rPr>
-        <w:t>•  It asks for a REASON → find the cause of “did not survive”.</w:t>
+        <w:t>•  Spot the colon after “ten minutes:” — it announces the explanation. Read to the right of it.</w:t>
       </w:r>
     </w:p>
     <w:p>
@@ -1291,7 +1459,7 @@
           <w:b w:val="0"/>
           <w:sz w:val="22"/>
         </w:rPr>
-        <w:t>•  The dash after “the crucible of time” introduces the real cause: exposure to air.</w:t>
+        <w:t>•  The purpose is a “to + verb” phrase: to draw young visitors into the exhibition halls.</w:t>
       </w:r>
     </w:p>
     <w:p>
@@ -1303,7 +1471,7 @@
           <w:b w:val="0"/>
           <w:sz w:val="22"/>
         </w:rPr>
-        <w:t>•  Paraphrase — do not copy the whole sentence.</w:t>
+        <w:t>•  The quotation marks around “a few old boats” support the idea: children need a reason to visit the museum.</w:t>
       </w:r>
     </w:p>
     <w:p>
@@ -1322,14 +1490,7 @@
           <w:b w:val="0"/>
           <w:sz w:val="22"/>
         </w:rPr>
-        <w:t xml:space="preserve">Because the colours were exposed to the (dry Xian) air and disintegrated.  </w:t>
-      </w:r>
-      <w:r>
-        <w:rPr>
-          <w:b w:val="0"/>
-          <w:sz w:val="18"/>
-        </w:rPr>
-        <w:t>(83% of candidates correct.)</w:t>
+        <w:t>To attract / draw young visitors into the museum’s exhibition halls so that they will see the displays.</w:t>
       </w:r>
     </w:p>
     <w:p>
@@ -1341,7 +1502,7 @@
           <w:b/>
           <w:sz w:val="22"/>
         </w:rPr>
-        <w:t>5. Demo Question 2 — Purpose (“What is the purpose of …?”)</w:t>
+        <w:t>6. Demo Question 2 — Purpose (“What is the purpose of …?”)</w:t>
       </w:r>
     </w:p>
     <w:p>
@@ -1353,7 +1514,7 @@
           <w:b/>
           <w:sz w:val="22"/>
         </w:rPr>
-        <w:t>Paragraph 7 (lines 79–81):</w:t>
+        <w:t>Read this paragraph (demo — not from the examination paper):</w:t>
       </w:r>
     </w:p>
     <w:p>
@@ -1365,7 +1526,7 @@
           <w:b w:val="0"/>
           <w:sz w:val="22"/>
         </w:rPr>
-        <w:t>“During a recent excavation, the moment a painted artifact was unearthed, workers sprayed any bit of exposed color with the solution, then wrapped it in plastic to keep in the protective moisture.”</w:t>
+        <w:t>“Every day, Hong Kong restaurants throw away hundreds of tonnes of edible food. To fight this waste, a charity has launched a ‘surprise meal’ scheme: chefs collect leftover ingredients and turn them into three-course dinners sold for a sixth of the normal price — the aim is simple, to keep good food out of the landfill. ‘We are not a soup kitchen,’ says founder Grace Lam. ‘We are a rescue team.’ Customers pay what they can, and anyone who cannot pay eats for free.”</w:t>
       </w:r>
     </w:p>
     <w:p>
@@ -1384,7 +1545,7 @@
           <w:b w:val="0"/>
           <w:sz w:val="22"/>
         </w:rPr>
-        <w:t>What is the purpose of wrapping the artifact in plastic?</w:t>
+        <w:t>What is the purpose of the ‘surprise meal’ scheme?</w:t>
       </w:r>
     </w:p>
     <w:p>
@@ -1408,7 +1569,7 @@
           <w:b w:val="0"/>
           <w:sz w:val="22"/>
         </w:rPr>
-        <w:t>•  It asks for a PURPOSE → look for “to + verb” or “so that”.</w:t>
+        <w:t>•  Two punctuation clues: the colon after “scheme:” and the dash after “normal price —”. Both introduce an explanation.</w:t>
       </w:r>
     </w:p>
     <w:p>
@@ -1420,7 +1581,7 @@
           <w:b w:val="0"/>
           <w:sz w:val="22"/>
         </w:rPr>
-        <w:t>•  The purpose comes right after “wrapped it in plastic”: to keep in the protective moisture.</w:t>
+        <w:t>•  Read right after the dash: “the aim is simple, to keep good food out of the landfill.”</w:t>
       </w:r>
     </w:p>
     <w:p>
@@ -1432,7 +1593,7 @@
           <w:b w:val="0"/>
           <w:sz w:val="22"/>
         </w:rPr>
-        <w:t>•  Answer with a “to …” phrase.</w:t>
+        <w:t>•  The opening phrase “To fight this waste” also tells you the aim — check the beginning of the paragraph too.</w:t>
       </w:r>
     </w:p>
     <w:p>
@@ -1451,14 +1612,7 @@
           <w:b w:val="0"/>
           <w:sz w:val="22"/>
         </w:rPr>
-        <w:t xml:space="preserve">To keep in the protective moisture / to keep the artifact wet / to protect it from the dry air.  </w:t>
-      </w:r>
-      <w:r>
-        <w:rPr>
-          <w:b w:val="0"/>
-          <w:sz w:val="18"/>
-        </w:rPr>
-        <w:t>(74% of candidates correct.)</w:t>
+        <w:t>To keep good food out of the landfill / to reduce the amount of edible food being wasted.</w:t>
       </w:r>
     </w:p>
     <w:p>

</xml_diff>

<commit_message>
Part B: trim teaching tips; add hidden reason-signal words (given, with, out of, prompted by...)
</commit_message>
<xml_diff>
--- a/F6_SP_Lesson_4_2013_Part_A_Open-Ended_Teacher_Version.docx
+++ b/F6_SP_Lesson_4_2013_Part_A_Open-Ended_Teacher_Version.docx
@@ -932,137 +932,19 @@
           <w:b/>
           <w:sz w:val="22"/>
         </w:rPr>
-        <w:t>1. Common ways DSE asks about reasons, purposes &amp; intentions</w:t>
+        <w:t>1. Question patterns to recognise</w:t>
       </w:r>
     </w:p>
     <w:p>
       <w:pPr>
-        <w:spacing w:after="0"/>
+        <w:spacing w:after="80"/>
       </w:pPr>
       <w:r>
         <w:rPr>
           <w:b w:val="0"/>
           <w:sz w:val="22"/>
         </w:rPr>
-        <w:t xml:space="preserve">•  </w:t>
-      </w:r>
-      <w:r>
-        <w:rPr>
-          <w:b/>
-          <w:sz w:val="22"/>
-        </w:rPr>
-        <w:t>Why …? / According to X, why …?</w:t>
-      </w:r>
-      <w:r>
-        <w:rPr>
-          <w:b w:val="0"/>
-          <w:sz w:val="22"/>
-        </w:rPr>
-        <w:t xml:space="preserve">  e.g. “According to paragraph 5, why did the colours of the warriors not survive?” (Q11)</w:t>
-      </w:r>
-    </w:p>
-    <w:p>
-      <w:pPr>
-        <w:spacing w:after="0"/>
-      </w:pPr>
-      <w:r>
-        <w:rPr>
-          <w:b w:val="0"/>
-          <w:sz w:val="22"/>
-        </w:rPr>
-        <w:t xml:space="preserve">•  </w:t>
-      </w:r>
-      <w:r>
-        <w:rPr>
-          <w:b/>
-          <w:sz w:val="22"/>
-        </w:rPr>
-        <w:t>Why should …?</w:t>
-      </w:r>
-      <w:r>
-        <w:rPr>
-          <w:b w:val="0"/>
-          <w:sz w:val="22"/>
-        </w:rPr>
-        <w:t xml:space="preserve">  e.g. “According to Rong Bo, why should the earth be treated like an artifact?” (Q19)</w:t>
-      </w:r>
-    </w:p>
-    <w:p>
-      <w:pPr>
-        <w:spacing w:after="0"/>
-      </w:pPr>
-      <w:r>
-        <w:rPr>
-          <w:b w:val="0"/>
-          <w:sz w:val="22"/>
-        </w:rPr>
-        <w:t xml:space="preserve">•  </w:t>
-      </w:r>
-      <w:r>
-        <w:rPr>
-          <w:b/>
-          <w:sz w:val="22"/>
-        </w:rPr>
-        <w:t>What is the purpose of …?</w:t>
-      </w:r>
-      <w:r>
-        <w:rPr>
-          <w:b w:val="0"/>
-          <w:sz w:val="22"/>
-        </w:rPr>
-        <w:t xml:space="preserve">  e.g. “What is the purpose of wrapping the artifact in plastic?” (Q15)</w:t>
-      </w:r>
-    </w:p>
-    <w:p>
-      <w:pPr>
-        <w:spacing w:after="0"/>
-      </w:pPr>
-      <w:r>
-        <w:rPr>
-          <w:b w:val="0"/>
-          <w:sz w:val="22"/>
-        </w:rPr>
-        <w:t xml:space="preserve">•  </w:t>
-      </w:r>
-      <w:r>
-        <w:rPr>
-          <w:b/>
-          <w:sz w:val="22"/>
-        </w:rPr>
-        <w:t>What does … show / tell us about …?</w:t>
-      </w:r>
-      <w:r>
-        <w:rPr>
-          <w:b w:val="0"/>
-          <w:sz w:val="22"/>
-        </w:rPr>
-        <w:t xml:space="preserve">  e.g. “In line 61, the writer mentions boiling an egg to show…” (Q12)</w:t>
-      </w:r>
-    </w:p>
-    <w:p>
-      <w:pPr>
-        <w:spacing w:after="0"/>
-      </w:pPr>
-      <w:r>
-        <w:rPr>
-          <w:b w:val="0"/>
-          <w:sz w:val="22"/>
-        </w:rPr>
-        <w:t xml:space="preserve">•  </w:t>
-      </w:r>
-      <w:r>
-        <w:rPr>
-          <w:b/>
-          <w:sz w:val="22"/>
-        </w:rPr>
-        <w:t>Why does the writer mention …? / What is the writer’s intention in …?</w:t>
-      </w:r>
-      <w:r>
-        <w:rPr>
-          <w:b w:val="0"/>
-          <w:sz w:val="22"/>
-        </w:rPr>
-        <w:t xml:space="preserve">  common in other years — same skill: find the writer’s reason for including a detail</w:t>
+        <w:t>Why …? / According to X, why …? / Why should …?   •   What is the purpose of …?   •   What does … show / tell us about …?   •   Why does the writer mention …?</w:t>
       </w:r>
     </w:p>
     <w:p>
@@ -1074,7 +956,7 @@
           <w:b/>
           <w:sz w:val="22"/>
         </w:rPr>
-        <w:t>2. Signal words — the answer usually sits right next to these</w:t>
+        <w:t>2. Words that signal a reason — watch for these</w:t>
       </w:r>
     </w:p>
     <w:p>
@@ -1083,24 +965,17 @@
       </w:pPr>
       <w:r>
         <w:rPr>
-          <w:b w:val="0"/>
-          <w:sz w:val="22"/>
-        </w:rPr>
-        <w:t xml:space="preserve">•  </w:t>
-      </w:r>
-      <w:r>
-        <w:rPr>
           <w:b/>
           <w:sz w:val="22"/>
         </w:rPr>
-        <w:t>Reasons / causes:</w:t>
+        <w:t xml:space="preserve">Easy to spot:  </w:t>
       </w:r>
       <w:r>
         <w:rPr>
           <w:b w:val="0"/>
           <w:sz w:val="22"/>
         </w:rPr>
-        <w:t xml:space="preserve">  because, since, as, due to, the reason is</w:t>
+        <w:t>because, since, as, due to, thanks to, so that, to + verb, in order to</w:t>
       </w:r>
     </w:p>
     <w:p>
@@ -1109,50 +984,17 @@
       </w:pPr>
       <w:r>
         <w:rPr>
-          <w:b w:val="0"/>
-          <w:sz w:val="22"/>
-        </w:rPr>
-        <w:t xml:space="preserve">•  </w:t>
-      </w:r>
-      <w:r>
-        <w:rPr>
           <w:b/>
           <w:sz w:val="22"/>
         </w:rPr>
-        <w:t>Purposes:</w:t>
+        <w:t xml:space="preserve">Easy to miss — teach these:  </w:t>
       </w:r>
       <w:r>
         <w:rPr>
           <w:b w:val="0"/>
           <w:sz w:val="22"/>
         </w:rPr>
-        <w:t xml:space="preserve">  to + verb, in order to, so that, for (+ noun)</w:t>
-      </w:r>
-    </w:p>
-    <w:p>
-      <w:pPr>
-        <w:spacing w:after="0"/>
-      </w:pPr>
-      <w:r>
-        <w:rPr>
-          <w:b w:val="0"/>
-          <w:sz w:val="22"/>
-        </w:rPr>
-        <w:t xml:space="preserve">•  </w:t>
-      </w:r>
-      <w:r>
-        <w:rPr>
-          <w:b/>
-          <w:sz w:val="22"/>
-        </w:rPr>
-        <w:t>Results / conclusions:</w:t>
-      </w:r>
-      <w:r>
-        <w:rPr>
-          <w:b w:val="0"/>
-          <w:sz w:val="22"/>
-        </w:rPr>
-        <w:t xml:space="preserve">  so, therefore, as a result — the reason often comes just before these</w:t>
+        <w:t>given + noun (“given the heat”), with + noun (“with heavy rain”), out of + noun (“out of fear”), prompted by, driven by, in an attempt to, so as to, for fear of, in response to</w:t>
       </w:r>
     </w:p>
     <w:p>
@@ -1176,21 +1018,7 @@
           <w:b w:val="0"/>
           <w:sz w:val="22"/>
         </w:rPr>
-        <w:t xml:space="preserve">•  </w:t>
-      </w:r>
-      <w:r>
-        <w:rPr>
-          <w:b/>
-          <w:sz w:val="22"/>
-        </w:rPr>
-        <w:t>Dash (—):</w:t>
-      </w:r>
-      <w:r>
-        <w:rPr>
-          <w:b w:val="0"/>
-          <w:sz w:val="22"/>
-        </w:rPr>
-        <w:t xml:space="preserve">  what follows often explains or gives the reason for what came before</w:t>
+        <w:t>•  Dash (—) and colon (:): the reason / explanation follows the mark.</w:t>
       </w:r>
     </w:p>
     <w:p>
@@ -1202,21 +1030,7 @@
           <w:b w:val="0"/>
           <w:sz w:val="22"/>
         </w:rPr>
-        <w:t xml:space="preserve">•  </w:t>
-      </w:r>
-      <w:r>
-        <w:rPr>
-          <w:b/>
-          <w:sz w:val="22"/>
-        </w:rPr>
-        <w:t>Colon (:):</w:t>
-      </w:r>
-      <w:r>
-        <w:rPr>
-          <w:b w:val="0"/>
-          <w:sz w:val="22"/>
-        </w:rPr>
-        <w:t xml:space="preserve">  announces an explanation or the answer itself</w:t>
+        <w:t>•  Quotation marks (“ ”): the speaker’s own words — the reason in “According to X” questions sits inside them.</w:t>
       </w:r>
     </w:p>
     <w:p>
@@ -1228,99 +1042,7 @@
           <w:b w:val="0"/>
           <w:sz w:val="22"/>
         </w:rPr>
-        <w:t xml:space="preserve">•  </w:t>
-      </w:r>
-      <w:r>
-        <w:rPr>
-          <w:b/>
-          <w:sz w:val="22"/>
-        </w:rPr>
-        <w:t>Quotation marks (“ ”):</w:t>
-      </w:r>
-      <w:r>
-        <w:rPr>
-          <w:b w:val="0"/>
-          <w:sz w:val="22"/>
-        </w:rPr>
-        <w:t xml:space="preserve">  for “According to X” questions, the reason is usually inside the quoted speech</w:t>
-      </w:r>
-    </w:p>
-    <w:p>
-      <w:pPr>
-        <w:spacing w:after="0"/>
-      </w:pPr>
-      <w:r>
-        <w:rPr>
-          <w:b w:val="0"/>
-          <w:sz w:val="22"/>
-        </w:rPr>
-        <w:t xml:space="preserve">•  </w:t>
-      </w:r>
-      <w:r>
-        <w:rPr>
-          <w:b/>
-          <w:sz w:val="22"/>
-        </w:rPr>
-        <w:t>Brackets ( ):</w:t>
-      </w:r>
-      <w:r>
-        <w:rPr>
-          <w:b w:val="0"/>
-          <w:sz w:val="22"/>
-        </w:rPr>
-        <w:t xml:space="preserve">  add a definition or extra information — useful for definition questions</w:t>
-      </w:r>
-    </w:p>
-    <w:p>
-      <w:pPr>
-        <w:spacing w:after="0"/>
-      </w:pPr>
-      <w:r>
-        <w:rPr>
-          <w:b w:val="0"/>
-          <w:sz w:val="22"/>
-        </w:rPr>
-        <w:t xml:space="preserve">•  </w:t>
-      </w:r>
-      <w:r>
-        <w:rPr>
-          <w:b/>
-          <w:sz w:val="22"/>
-        </w:rPr>
-        <w:t>Semicolon (;):</w:t>
-      </w:r>
-      <w:r>
-        <w:rPr>
-          <w:b w:val="0"/>
-          <w:sz w:val="22"/>
-        </w:rPr>
-        <w:t xml:space="preserve">  links two closely related ideas — the reason can sit on either side</w:t>
-      </w:r>
-    </w:p>
-    <w:p>
-      <w:pPr>
-        <w:spacing w:after="0"/>
-      </w:pPr>
-      <w:r>
-        <w:rPr>
-          <w:b w:val="0"/>
-          <w:sz w:val="22"/>
-        </w:rPr>
-        <w:t xml:space="preserve">•  </w:t>
-      </w:r>
-      <w:r>
-        <w:rPr>
-          <w:b/>
-          <w:sz w:val="22"/>
-        </w:rPr>
-        <w:t>Rhetorical question (?):</w:t>
-      </w:r>
-      <w:r>
-        <w:rPr>
-          <w:b w:val="0"/>
-          <w:sz w:val="22"/>
-        </w:rPr>
-        <w:t xml:space="preserve">  the writer may ask a question and then answer it himself — the answer is the reason</w:t>
+        <w:t>•  Brackets ( ), semicolon (;): extra information; two linked ideas — the reason can be on either side.</w:t>
       </w:r>
     </w:p>
     <w:p>
@@ -1356,7 +1078,7 @@
           <w:b w:val="0"/>
           <w:sz w:val="22"/>
         </w:rPr>
-        <w:t>Step 2 — Find the signal word (because / to / so that) or the punctuation clue (— : ; “ ”) in the paragraph.</w:t>
+        <w:t>Step 2 — Find a signal word (because, to, so that, given, with …) or a punctuation clue (— :).</w:t>
       </w:r>
     </w:p>
     <w:p>
@@ -1368,7 +1090,7 @@
           <w:b w:val="0"/>
           <w:sz w:val="22"/>
         </w:rPr>
-        <w:t>Step 3 — Answer in your own words: a “why” answer needs a CAUSE; a “purpose” answer starts with “to …” or “so that …”.</w:t>
+        <w:t>Step 3 — Answer in your own words: “why” needs a CAUSE; “purpose” starts with “to …” or “so that …”.</w:t>
       </w:r>
     </w:p>
     <w:p>

</xml_diff>

<commit_message>
Part B: reorder demos; Demo 2 becomes a reason question on spotting the easily-missed 'given' hint
</commit_message>
<xml_diff>
--- a/F6_SP_Lesson_4_2013_Part_A_Open-Ended_Teacher_Version.docx
+++ b/F6_SP_Lesson_4_2013_Part_A_Open-Ended_Teacher_Version.docx
@@ -1126,128 +1126,6 @@
           <w:b w:val="0"/>
           <w:sz w:val="22"/>
         </w:rPr>
-        <w:t>“Every summer, the city’s Maritime Museum hosts a model-ship race for children. Families crowd the harbour wall to watch, but the race itself lasts only ten minutes: the real goal is to draw young visitors into the exhibition halls, where full-size replicas of ancient junks hang from the ceiling. Curator Mei Ling knows that few parents will bring their children through the door for ‘a few old boats’, yet a race day never fails to fill the galleries.”</w:t>
-      </w:r>
-    </w:p>
-    <w:p>
-      <w:pPr>
-        <w:spacing w:after="80"/>
-      </w:pPr>
-      <w:r>
-        <w:rPr>
-          <w:b/>
-          <w:sz w:val="22"/>
-        </w:rPr>
-        <w:t xml:space="preserve">Open-ended question:  </w:t>
-      </w:r>
-      <w:r>
-        <w:rPr>
-          <w:b w:val="0"/>
-          <w:sz w:val="22"/>
-        </w:rPr>
-        <w:t>What is the purpose of the model-ship race?</w:t>
-      </w:r>
-    </w:p>
-    <w:p>
-      <w:pPr>
-        <w:spacing w:after="0"/>
-      </w:pPr>
-      <w:r>
-        <w:rPr>
-          <w:b/>
-          <w:sz w:val="22"/>
-        </w:rPr>
-        <w:t>Hints for students:</w:t>
-      </w:r>
-    </w:p>
-    <w:p>
-      <w:pPr>
-        <w:spacing w:after="0"/>
-      </w:pPr>
-      <w:r>
-        <w:rPr>
-          <w:b w:val="0"/>
-          <w:sz w:val="22"/>
-        </w:rPr>
-        <w:t>•  Spot the colon after “ten minutes:” — it announces the explanation. Read to the right of it.</w:t>
-      </w:r>
-    </w:p>
-    <w:p>
-      <w:pPr>
-        <w:spacing w:after="0"/>
-      </w:pPr>
-      <w:r>
-        <w:rPr>
-          <w:b w:val="0"/>
-          <w:sz w:val="22"/>
-        </w:rPr>
-        <w:t>•  The purpose is a “to + verb” phrase: to draw young visitors into the exhibition halls.</w:t>
-      </w:r>
-    </w:p>
-    <w:p>
-      <w:pPr>
-        <w:spacing w:after="0"/>
-      </w:pPr>
-      <w:r>
-        <w:rPr>
-          <w:b w:val="0"/>
-          <w:sz w:val="22"/>
-        </w:rPr>
-        <w:t>•  The quotation marks around “a few old boats” support the idea: children need a reason to visit the museum.</w:t>
-      </w:r>
-    </w:p>
-    <w:p>
-      <w:pPr>
-        <w:spacing w:before="80" w:after="80"/>
-      </w:pPr>
-      <w:r>
-        <w:rPr>
-          <w:b/>
-          <w:sz w:val="22"/>
-        </w:rPr>
-        <w:t xml:space="preserve">Model answer:  </w:t>
-      </w:r>
-      <w:r>
-        <w:rPr>
-          <w:b w:val="0"/>
-          <w:sz w:val="22"/>
-        </w:rPr>
-        <w:t>To attract / draw young visitors into the museum’s exhibition halls so that they will see the displays.</w:t>
-      </w:r>
-    </w:p>
-    <w:p>
-      <w:pPr>
-        <w:spacing w:before="80" w:after="80"/>
-      </w:pPr>
-      <w:r>
-        <w:rPr>
-          <w:b/>
-          <w:sz w:val="22"/>
-        </w:rPr>
-        <w:t>6. Demo Question 2 — Purpose (“What is the purpose of …?”)</w:t>
-      </w:r>
-    </w:p>
-    <w:p>
-      <w:pPr>
-        <w:spacing w:after="0"/>
-      </w:pPr>
-      <w:r>
-        <w:rPr>
-          <w:b/>
-          <w:sz w:val="22"/>
-        </w:rPr>
-        <w:t>Read this paragraph (demo — not from the examination paper):</w:t>
-      </w:r>
-    </w:p>
-    <w:p>
-      <w:pPr>
-        <w:spacing w:after="80"/>
-      </w:pPr>
-      <w:r>
-        <w:rPr>
-          <w:b w:val="0"/>
-          <w:sz w:val="22"/>
-        </w:rPr>
         <w:t>“Every day, Hong Kong restaurants throw away hundreds of tonnes of edible food. To fight this waste, a charity has launched a ‘surprise meal’ scheme: chefs collect leftover ingredients and turn them into three-course dinners sold for a sixth of the normal price — the aim is simple, to keep good food out of the landfill. ‘We are not a soup kitchen,’ says founder Grace Lam. ‘We are a rescue team.’ Customers pay what they can, and anyone who cannot pay eats for free.”</w:t>
       </w:r>
     </w:p>
@@ -1335,6 +1213,128 @@
           <w:sz w:val="22"/>
         </w:rPr>
         <w:t>To keep good food out of the landfill / to reduce the amount of edible food being wasted.</w:t>
+      </w:r>
+    </w:p>
+    <w:p>
+      <w:pPr>
+        <w:spacing w:before="80" w:after="80"/>
+      </w:pPr>
+      <w:r>
+        <w:rPr>
+          <w:b/>
+          <w:sz w:val="22"/>
+        </w:rPr>
+        <w:t>6. Demo Question 2 — Reason (“Why …?”)</w:t>
+      </w:r>
+    </w:p>
+    <w:p>
+      <w:pPr>
+        <w:spacing w:after="0"/>
+      </w:pPr>
+      <w:r>
+        <w:rPr>
+          <w:b/>
+          <w:sz w:val="22"/>
+        </w:rPr>
+        <w:t>Read this paragraph (demo — not from the examination paper):</w:t>
+      </w:r>
+    </w:p>
+    <w:p>
+      <w:pPr>
+        <w:spacing w:after="80"/>
+      </w:pPr>
+      <w:r>
+        <w:rPr>
+          <w:b w:val="0"/>
+          <w:sz w:val="22"/>
+        </w:rPr>
+        <w:t>“Every summer, the city’s Maritime Museum hosts a model-ship race for children. Families crowd the harbour wall to watch the race, which lasts only ten minutes — the real goal is to draw young visitors into the exhibition halls. Visitors who race a boat usually beg their parents for a second visit; given the museum’s modest entrance fee, few families refuse.”</w:t>
+      </w:r>
+    </w:p>
+    <w:p>
+      <w:pPr>
+        <w:spacing w:after="80"/>
+      </w:pPr>
+      <w:r>
+        <w:rPr>
+          <w:b/>
+          <w:sz w:val="22"/>
+        </w:rPr>
+        <w:t xml:space="preserve">Open-ended question:  </w:t>
+      </w:r>
+      <w:r>
+        <w:rPr>
+          <w:b w:val="0"/>
+          <w:sz w:val="22"/>
+        </w:rPr>
+        <w:t>According to the paragraph, why do few families refuse a second visit to the museum?</w:t>
+      </w:r>
+    </w:p>
+    <w:p>
+      <w:pPr>
+        <w:spacing w:after="0"/>
+      </w:pPr>
+      <w:r>
+        <w:rPr>
+          <w:b/>
+          <w:sz w:val="22"/>
+        </w:rPr>
+        <w:t>Hints for students:</w:t>
+      </w:r>
+    </w:p>
+    <w:p>
+      <w:pPr>
+        <w:spacing w:after="0"/>
+      </w:pPr>
+      <w:r>
+        <w:rPr>
+          <w:b w:val="0"/>
+          <w:sz w:val="22"/>
+        </w:rPr>
+        <w:t>•  The question asks for a REASON → hunt for a signal word you would normally skip over.</w:t>
+      </w:r>
+    </w:p>
+    <w:p>
+      <w:pPr>
+        <w:spacing w:after="0"/>
+      </w:pPr>
+      <w:r>
+        <w:rPr>
+          <w:b w:val="0"/>
+          <w:sz w:val="22"/>
+        </w:rPr>
+        <w:t>•  “given the museum’s modest entrance fee” = “because the entrance fee is low” — given + noun is an easy-to-miss reason signal.</w:t>
+      </w:r>
+    </w:p>
+    <w:p>
+      <w:pPr>
+        <w:spacing w:after="0"/>
+      </w:pPr>
+      <w:r>
+        <w:rPr>
+          <w:b w:val="0"/>
+          <w:sz w:val="22"/>
+        </w:rPr>
+        <w:t>•  The semicolon links two ideas — read the second one for the reason.</w:t>
+      </w:r>
+    </w:p>
+    <w:p>
+      <w:pPr>
+        <w:spacing w:before="80" w:after="80"/>
+      </w:pPr>
+      <w:r>
+        <w:rPr>
+          <w:b/>
+          <w:sz w:val="22"/>
+        </w:rPr>
+        <w:t xml:space="preserve">Model answer:  </w:t>
+      </w:r>
+      <w:r>
+        <w:rPr>
+          <w:b w:val="0"/>
+          <w:sz w:val="22"/>
+        </w:rPr>
+        <w:t>Because the museum’s entrance fee is low / modest.</w:t>
       </w:r>
     </w:p>
     <w:p>

</xml_diff>

<commit_message>
Lesson 4 pack: revised teacher's (Text 1, line N refs, US spelling), student's version, 14-slide PPT with click-reveal timing
</commit_message>
<xml_diff>
--- a/F6_SP_Lesson_4_2013_Part_A_Open-Ended_Teacher_Version.docx
+++ b/F6_SP_Lesson_4_2013_Part_A_Open-Ended_Teacher_Version.docx
@@ -170,7 +170,7 @@
                 <w:b w:val="0"/>
                 <w:sz w:val="22"/>
               </w:rPr>
-              <w:t>T1, l.1</w:t>
+              <w:t>Text 1, line 1</w:t>
             </w:r>
           </w:p>
         </w:tc>
@@ -247,7 +247,7 @@
                 <w:b w:val="0"/>
                 <w:sz w:val="22"/>
               </w:rPr>
-              <w:t>T1, l.2</w:t>
+              <w:t>Text 1, line 2</w:t>
             </w:r>
           </w:p>
         </w:tc>
@@ -324,7 +324,7 @@
                 <w:b w:val="0"/>
                 <w:sz w:val="22"/>
               </w:rPr>
-              <w:t>T1, l.3</w:t>
+              <w:t>Text 1, line 3</w:t>
             </w:r>
           </w:p>
         </w:tc>
@@ -401,7 +401,7 @@
                 <w:b w:val="0"/>
                 <w:sz w:val="22"/>
               </w:rPr>
-              <w:t>T1, l.3</w:t>
+              <w:t>Text 1, line 3</w:t>
             </w:r>
           </w:p>
         </w:tc>
@@ -478,7 +478,7 @@
                 <w:b w:val="0"/>
                 <w:sz w:val="22"/>
               </w:rPr>
-              <w:t>T1, l.22</w:t>
+              <w:t>Text 1, line 22</w:t>
             </w:r>
           </w:p>
         </w:tc>
@@ -555,7 +555,7 @@
                 <w:b w:val="0"/>
                 <w:sz w:val="22"/>
               </w:rPr>
-              <w:t>T1, l.28</w:t>
+              <w:t>Text 1, line 28</w:t>
             </w:r>
           </w:p>
         </w:tc>
@@ -632,7 +632,7 @@
                 <w:b w:val="0"/>
                 <w:sz w:val="22"/>
               </w:rPr>
-              <w:t>T1, l.36</w:t>
+              <w:t>Text 1, line 36</w:t>
             </w:r>
           </w:p>
         </w:tc>
@@ -709,7 +709,7 @@
                 <w:b w:val="0"/>
                 <w:sz w:val="22"/>
               </w:rPr>
-              <w:t>T1, l.62</w:t>
+              <w:t>Text 1, line 62</w:t>
             </w:r>
           </w:p>
         </w:tc>
@@ -786,7 +786,7 @@
                 <w:b w:val="0"/>
                 <w:sz w:val="22"/>
               </w:rPr>
-              <w:t>T1, l.65</w:t>
+              <w:t>Text 1, line 65</w:t>
             </w:r>
           </w:p>
         </w:tc>
@@ -863,7 +863,7 @@
                 <w:b w:val="0"/>
                 <w:sz w:val="22"/>
               </w:rPr>
-              <w:t>T1, l.91</w:t>
+              <w:t>Text 1, line 91</w:t>
             </w:r>
           </w:p>
         </w:tc>
@@ -1517,7 +1517,7 @@
           <w:b/>
           <w:sz w:val="22"/>
         </w:rPr>
-        <w:t>Find a word in paragraph 4 that means ‘not colourful’.</w:t>
+        <w:t>Find a word in paragraph 4 that means ‘not colorful’.</w:t>
       </w:r>
     </w:p>
     <w:p>
@@ -1565,7 +1565,7 @@
               <w:rPr>
                 <w:sz w:val="20"/>
               </w:rPr>
-              <w:t>Paragraph 4 (line 33): “The monochrome figures that visitors to Xian’s terra-cotta army museum see today…” — mono = one, chrome = colour → one colour = not colourful. (1 mark; 37% of candidates correct.)</w:t>
+              <w:t>Paragraph 4 (line 33): “The monochrome figures that visitors to Xian’s terra-cotta army museum see today…” — mono = one, chrome = colour (one colour) → not colorful. (1 mark; 37% of candidates correct.)</w:t>
             </w:r>
           </w:p>
         </w:tc>
@@ -1587,7 +1587,7 @@
           <w:b/>
           <w:sz w:val="22"/>
         </w:rPr>
-        <w:t>According to paragraph 5, why did the colours of the warriors not survive?</w:t>
+        <w:t>According to paragraph 5, why did the colors of the warriors not survive?</w:t>
       </w:r>
     </w:p>
     <w:p>
@@ -1606,7 +1606,7 @@
           <w:b w:val="0"/>
           <w:sz w:val="22"/>
         </w:rPr>
-        <w:t>Because the colours were exposed to the (dry Xian) air and disintegrated.</w:t>
+        <w:t>Because the colors were exposed to the (dry Xian) air and disintegrated.</w:t>
       </w:r>
     </w:p>
     <w:tbl>
@@ -1635,7 +1635,7 @@
               <w:rPr>
                 <w:sz w:val="20"/>
               </w:rPr>
-              <w:t>Paragraph 5 (lines 51–56): “…most of the colors did not survive the crucible of time — or the exposure to air that comes with discovery and excavation. In earlier digs, archaeologists often watched helplessly as the warriors’ colors disintegrated in the dry Xian air.” — exposure to the dry air made the colours flake off. (1 mark; 83% of candidates correct.)</w:t>
+              <w:t>Paragraph 5 (lines 51–56): “…most of the colors did not survive the crucible of time — or the exposure to air that comes with discovery and excavation. In earlier digs, archaeologists often watched helplessly as the warriors’ colors disintegrated in the dry Xian air.” — exposure to the dry air made the colors flake off. (1 mark; 83% of candidates correct.)</w:t>
             </w:r>
           </w:p>
         </w:tc>
@@ -1845,7 +1845,7 @@
               <w:rPr>
                 <w:sz w:val="20"/>
               </w:rPr>
-              <w:t>Paragraph 7 (lines 79–81): “…workers sprayed any bit of exposed color with the solution, then wrapped it in plastic to keep in the protective moisture.” — the plastic traps the moisture so the colour does not dry out and flake off. Purpose questions need a “to …” / “so that …” answer. (1 mark; 74% of candidates correct.)</w:t>
+              <w:t>Paragraph 7 (lines 79–81): “…workers sprayed any bit of exposed color with the solution, then wrapped it in plastic to keep in the protective moisture.” — the plastic traps the moisture so the color does not dry out and flake off. Purpose questions need a “to …” / “so that …” answer. (1 mark; 74% of candidates correct.)</w:t>
             </w:r>
           </w:p>
         </w:tc>
@@ -1886,7 +1886,7 @@
           <w:b w:val="0"/>
           <w:sz w:val="22"/>
         </w:rPr>
-        <w:t>Because so much colour and artistry has been imprinted on the soil — the ancient paint adheres to dirt more readily than to lacquer.</w:t>
+        <w:t>Because so much color and artistry has been imprinted on the soil — the ancient paint adheres to dirt more readily than to lacquer.</w:t>
       </w:r>
     </w:p>
     <w:tbl>
@@ -1937,7 +1937,7 @@
           <w:b/>
           <w:sz w:val="22"/>
         </w:rPr>
-        <w:t>Based on the information in paragraph 10, complete the following text by writing ONE word to fill in each blank. Make sure your answers are grammatically correct, paying attention to word form, plurals, etc. (4 marks)</w:t>
+        <w:t>Based on the information in paragraph 10, complete the following text by writing ONE word to fill in each blank. You should make sure that your answers are grammatically correct, paying attention to word form, plurals, etc. (4 marks)</w:t>
       </w:r>
     </w:p>
     <w:p>
@@ -1985,7 +1985,7 @@
               <w:rPr>
                 <w:sz w:val="20"/>
               </w:rPr>
-              <w:t>Paragraph 10 (lines 112–118): “‘We are treating the earth as an artifact,’ says Rong Bo, the museum’s head chemist, who helped develop a binding agent that holds the soil together…. The next challenge, Rong says, will be to find an acceptable method for reapplying this color to the warriors.” — Blank (iv) needs a singular noun: “binding agent”. Percentages per blank: (i) 47%  (ii) 62%  (iii) 63%  (iv) 63%. (4 marks.)</w:t>
+              <w:t>Gapped text: “The next challenge for (i)________ is to (ii)________ a procedure for (iii)________ color to the warriors now that a (iv)________ has been developed to hold together the soil.” — Paragraph 10 (lines 112–118): “…Rong Bo, the museum’s head chemist, who helped develop a binding agent that holds the soil together…. The next challenge, Rong says, will be to find an acceptable method for reapplying this color to the warriors.” Blank (iv) needs a singular noun: “binding agent”. Percentages per blank: (i) 47%  (ii) 62%  (iii) 63%  (iv) 63%. (4 marks.)</w:t>
             </w:r>
           </w:p>
         </w:tc>

</xml_diff>